<commit_message>
fixed spacing issue in margin of resume
</commit_message>
<xml_diff>
--- a/assets/files/resume3.docx
+++ b/assets/files/resume3.docx
@@ -2072,6 +2072,7 @@
         </w:rPr>
         <w:t xml:space="preserve">Doctor of Philosophy in Space Propulsion (Aerospace </w:t>
       </w:r>
+      <w:proofErr w:type="gramStart"/>
       <w:r>
         <w:rPr>
           <w:rFonts w:ascii="Times" w:hAnsi="Times"/>
@@ -2097,7 +2098,17 @@
           <w:sz w:val="23"/>
           <w:szCs w:val="23"/>
         </w:rPr>
-        <w:t xml:space="preserve">   </w:t>
+        <w:t xml:space="preserve"> </w:t>
+      </w:r>
+      <w:proofErr w:type="gramEnd"/>
+      <w:r>
+        <w:rPr>
+          <w:rFonts w:ascii="Times" w:hAnsi="Times"/>
+          <w:iCs/>
+          <w:sz w:val="23"/>
+          <w:szCs w:val="23"/>
+        </w:rPr>
+        <w:t xml:space="preserve">  </w:t>
       </w:r>
       <w:r>
         <w:rPr>
@@ -2139,11 +2150,29 @@
       <w:r>
         <w:rPr>
           <w:rFonts w:ascii="Times" w:hAnsi="Times"/>
+          <w:iCs/>
+          <w:sz w:val="10"/>
+          <w:szCs w:val="10"/>
+        </w:rPr>
+        <w:t xml:space="preserve"> </w:t>
+      </w:r>
+      <w:r>
+        <w:rPr>
+          <w:rFonts w:ascii="Times" w:hAnsi="Times"/>
           <w:i/>
           <w:sz w:val="23"/>
           <w:szCs w:val="23"/>
         </w:rPr>
-        <w:t>Sept 2019 - June 2023</w:t>
+        <w:t>Sept 2019 - June 202</w:t>
+      </w:r>
+      <w:r>
+        <w:rPr>
+          <w:rFonts w:ascii="Times" w:hAnsi="Times"/>
+          <w:i/>
+          <w:sz w:val="23"/>
+          <w:szCs w:val="23"/>
+        </w:rPr>
+        <w:t>3</w:t>
       </w:r>
     </w:p>
     <w:p>
@@ -2286,7 +2315,27 @@
           <w:szCs w:val="23"/>
         </w:rPr>
         <w:tab/>
-        <w:t xml:space="preserve">                          Sept 2013 - June 2017</w:t>
+        <w:t xml:space="preserve">                          </w:t>
+      </w:r>
+      <w:r>
+        <w:rPr>
+          <w:rFonts w:ascii="Times" w:hAnsi="Times"/>
+          <w:i/>
+          <w:iCs/>
+          <w:sz w:val="10"/>
+          <w:szCs w:val="10"/>
+        </w:rPr>
+        <w:t xml:space="preserve"> </w:t>
+      </w:r>
+      <w:r>
+        <w:rPr>
+          <w:rFonts w:ascii="Times" w:hAnsi="Times"/>
+          <w:i/>
+          <w:iCs/>
+          <w:sz w:val="23"/>
+          <w:szCs w:val="23"/>
+        </w:rPr>
+        <w:t>Sept 2013 - June 2017</w:t>
       </w:r>
     </w:p>
     <w:p>

</xml_diff>

<commit_message>
update resume ML bullet point
</commit_message>
<xml_diff>
--- a/assets/files/resume3.docx
+++ b/assets/files/resume3.docx
@@ -402,10 +402,52 @@
       <w:r>
         <w:rPr>
           <w:rFonts w:ascii="Times New Roman" w:hAnsi="Times New Roman" w:cs="Times New Roman"/>
-          <w:sz w:val="23"/>
-          <w:szCs w:val="23"/>
-        </w:rPr>
-        <w:t xml:space="preserve"> developed neural surrogates for a PDE model for faster pressure and force prediction; used symmetry-aware architectures, physics-informed features, and constrained outputs; improved predictions with learned discrepancy terms fit to telemetry</w:t>
+          <w:b/>
+          <w:bCs/>
+          <w:sz w:val="23"/>
+          <w:szCs w:val="23"/>
+        </w:rPr>
+        <w:t xml:space="preserve"> </w:t>
+      </w:r>
+      <w:r>
+        <w:rPr>
+          <w:rFonts w:ascii="Times New Roman" w:hAnsi="Times New Roman" w:cs="Times New Roman"/>
+          <w:sz w:val="23"/>
+          <w:szCs w:val="23"/>
+        </w:rPr>
+        <w:t>developed neural surrogates for a PDE model to predict resin forces in 100</w:t>
+      </w:r>
+      <w:r>
+        <w:rPr>
+          <w:rFonts w:ascii="Times New Roman" w:hAnsi="Times New Roman" w:cs="Times New Roman"/>
+          <w:sz w:val="23"/>
+          <w:szCs w:val="23"/>
+        </w:rPr>
+        <w:t>0</w:t>
+      </w:r>
+      <w:r>
+        <w:rPr>
+          <w:rFonts w:ascii="Times New Roman" w:hAnsi="Times New Roman" w:cs="Times New Roman"/>
+          <w:sz w:val="23"/>
+          <w:szCs w:val="23"/>
+        </w:rPr>
+        <w:t>x less run time;</w:t>
+      </w:r>
+      <w:r>
+        <w:rPr>
+          <w:rFonts w:ascii="Times New Roman" w:hAnsi="Times New Roman" w:cs="Times New Roman"/>
+          <w:sz w:val="23"/>
+          <w:szCs w:val="23"/>
+        </w:rPr>
+        <w:t xml:space="preserve"> </w:t>
+      </w:r>
+      <w:r>
+        <w:rPr>
+          <w:rFonts w:ascii="Times New Roman" w:hAnsi="Times New Roman" w:cs="Times New Roman"/>
+          <w:sz w:val="23"/>
+          <w:szCs w:val="23"/>
+        </w:rPr>
+        <w:t>used equivariant architectures, physics-informed features / losses, and discrepancy terms fit to real data</w:t>
       </w:r>
     </w:p>
     <w:p>

</xml_diff>